<commit_message>
Remove emoji from guide and README
Strips the decorative emoji (warning signs, check/cross marks, key,
page, lifebuoy, writing hand, lightning bolt) from both documents.

Where an emoji carried meaning rather than decoration, the meaning is
now carried by words: the Community product list says 'you need this'
and 'not needed' in text, and references to Workbench's run button say
'the lightning bolt icon'.

Kept: the arrow used for menu paths, the Mac command symbol, and the
refresh arrow - these are typographic symbols, not emoji, and removing
them would cost clarity.
</commit_message>
<xml_diff>
--- a/docs/MySQL-Setup-Guide.docx
+++ b/docs/MySQL-Setup-Guide.docx
@@ -1191,7 +1191,7 @@
       </w:pPr>
       <w:bookmarkStart w:id="21" w:name="the-1-thing-people-get-wrong"/>
       <w:r>
-        <w:t xml:space="preserve">⚠️ THE #1 THING PEOPLE GET WRONG</w:t>
+        <w:t xml:space="preserve">THE #1 THING PEOPLE GET WRONG</w:t>
       </w:r>
       <w:bookmarkEnd w:id="21"/>
     </w:p>
@@ -1644,7 +1644,71 @@
         <w:t xml:space="preserve"> </w:t>
       </w:r>
       <w:r>
-        <w:t xml:space="preserve">— the database itself ✅</w:t>
+        <w:t xml:space="preserve">— the database itself —</w:t>
+      </w:r>
+      <w:r>
+        <w:t xml:space="preserve"> </w:t>
+      </w:r>
+      <w:r>
+        <w:rPr>
+          <w:b/>
+          <w:bCs/>
+        </w:rPr>
+        <w:t xml:space="preserve">you need this</w:t>
+      </w:r>
+    </w:p>
+    <w:p>
+      <w:pPr>
+        <w:pStyle w:val="Compact"/>
+        <w:numPr>
+          <w:ilvl w:val="0"/>
+          <w:numId w:val="1003"/>
+        </w:numPr>
+      </w:pPr>
+      <w:r>
+        <w:rPr>
+          <w:b/>
+          <w:bCs/>
+        </w:rPr>
+        <w:t xml:space="preserve">MySQL Workbench</w:t>
+      </w:r>
+      <w:r>
+        <w:t xml:space="preserve"> </w:t>
+      </w:r>
+      <w:r>
+        <w:t xml:space="preserve">— the graphical design and administration tool —</w:t>
+      </w:r>
+      <w:r>
+        <w:t xml:space="preserve"> </w:t>
+      </w:r>
+      <w:r>
+        <w:rPr>
+          <w:b/>
+          <w:bCs/>
+        </w:rPr>
+        <w:t xml:space="preserve">you need this</w:t>
+      </w:r>
+    </w:p>
+    <w:p>
+      <w:pPr>
+        <w:pStyle w:val="Compact"/>
+        <w:numPr>
+          <w:ilvl w:val="0"/>
+          <w:numId w:val="1003"/>
+        </w:numPr>
+      </w:pPr>
+      <w:r>
+        <w:rPr>
+          <w:b/>
+          <w:bCs/>
+        </w:rPr>
+        <w:t xml:space="preserve">MySQL Shell</w:t>
+      </w:r>
+      <w:r>
+        <w:t xml:space="preserve"> </w:t>
+      </w:r>
+      <w:r>
+        <w:t xml:space="preserve">— an advanced text-only command-line tool —</w:t>
       </w:r>
       <w:r>
         <w:t xml:space="preserve"> </w:t>
@@ -1654,7 +1718,7 @@
           <w:i/>
           <w:iCs/>
         </w:rPr>
-        <w:t xml:space="preserve">you need this</w:t>
+        <w:t xml:space="preserve">not needed for this course</w:t>
       </w:r>
     </w:p>
     <w:p>
@@ -1670,77 +1734,13 @@
           <w:b/>
           <w:bCs/>
         </w:rPr>
-        <w:t xml:space="preserve">MySQL Workbench</w:t>
-      </w:r>
-      <w:r>
-        <w:t xml:space="preserve"> </w:t>
-      </w:r>
-      <w:r>
-        <w:t xml:space="preserve">— the graphical design and administration tool ✅</w:t>
-      </w:r>
-      <w:r>
-        <w:t xml:space="preserve"> </w:t>
-      </w:r>
-      <w:r>
-        <w:rPr>
-          <w:i/>
-          <w:iCs/>
-        </w:rPr>
-        <w:t xml:space="preserve">you need this</w:t>
-      </w:r>
-    </w:p>
-    <w:p>
-      <w:pPr>
-        <w:pStyle w:val="Compact"/>
-        <w:numPr>
-          <w:ilvl w:val="0"/>
-          <w:numId w:val="1003"/>
-        </w:numPr>
-      </w:pPr>
-      <w:r>
-        <w:rPr>
-          <w:b/>
-          <w:bCs/>
-        </w:rPr>
-        <w:t xml:space="preserve">MySQL Shell</w:t>
-      </w:r>
-      <w:r>
-        <w:t xml:space="preserve"> </w:t>
-      </w:r>
-      <w:r>
-        <w:t xml:space="preserve">— an advanced text-only command-line tool ❌</w:t>
-      </w:r>
-      <w:r>
-        <w:t xml:space="preserve"> </w:t>
-      </w:r>
-      <w:r>
-        <w:rPr>
-          <w:i/>
-          <w:iCs/>
-        </w:rPr>
-        <w:t xml:space="preserve">not needed</w:t>
-      </w:r>
-    </w:p>
-    <w:p>
-      <w:pPr>
-        <w:pStyle w:val="Compact"/>
-        <w:numPr>
-          <w:ilvl w:val="0"/>
-          <w:numId w:val="1003"/>
-        </w:numPr>
-      </w:pPr>
-      <w:r>
-        <w:rPr>
-          <w:b/>
-          <w:bCs/>
-        </w:rPr>
         <w:t xml:space="preserve">Connectors</w:t>
       </w:r>
       <w:r>
         <w:t xml:space="preserve"> </w:t>
       </w:r>
       <w:r>
-        <w:t xml:space="preserve">(Connector/J, Connector/Python, Connector/NET) — plumbing that lets programs written in Java, Python, or C# talk to MySQL ❌</w:t>
+        <w:t xml:space="preserve">(Connector/J, Connector/Python, Connector/NET) — plumbing that lets programs written in Java, Python, or C# talk to MySQL —</w:t>
       </w:r>
       <w:r>
         <w:t xml:space="preserve"> </w:t>
@@ -5450,12 +5450,6 @@
         <w:pStyle w:val="BlockText"/>
       </w:pPr>
       <w:r>
-        <w:t xml:space="preserve">✍️</w:t>
-      </w:r>
-      <w:r>
-        <w:t xml:space="preserve"> </w:t>
-      </w:r>
-      <w:r>
         <w:rPr>
           <w:b/>
           <w:bCs/>
@@ -7595,7 +7589,7 @@
         <w:t xml:space="preserve"> </w:t>
       </w:r>
       <w:r>
-        <w:t xml:space="preserve">icon (⚡) above the box. Or press</w:t>
+        <w:t xml:space="preserve">icon above the box. Or press</w:t>
       </w:r>
       <w:r>
         <w:t xml:space="preserve"> </w:t>
@@ -7849,7 +7843,7 @@
       </w:pPr>
       <w:bookmarkStart w:id="52" w:name="you-can-do-this-at-any-time"/>
       <w:r>
-        <w:t xml:space="preserve">✅ You can do this at any time</w:t>
+        <w:t xml:space="preserve">You can do this at any time</w:t>
       </w:r>
       <w:bookmarkEnd w:id="52"/>
     </w:p>
@@ -8182,12 +8176,6 @@
         <w:pStyle w:val="BlockText"/>
       </w:pPr>
       <w:r>
-        <w:t xml:space="preserve">⚠️</w:t>
-      </w:r>
-      <w:r>
-        <w:t xml:space="preserve"> </w:t>
-      </w:r>
-      <w:r>
         <w:rPr>
           <w:b/>
           <w:bCs/>
@@ -8410,7 +8398,7 @@
         <w:t xml:space="preserve"> </w:t>
       </w:r>
       <w:r>
-        <w:t xml:space="preserve">(⚡) to run the whole file.</w:t>
+        <w:t xml:space="preserve">icon to run the whole file.</w:t>
       </w:r>
     </w:p>
     <w:p>
@@ -8522,7 +8510,7 @@
         <w:t xml:space="preserve"> </w:t>
       </w:r>
       <w:r>
-        <w:t xml:space="preserve">(⚡).</w:t>
+        <w:t xml:space="preserve">icon.</w:t>
       </w:r>
     </w:p>
     <w:p>
@@ -8553,7 +8541,7 @@
       </w:pPr>
       <w:bookmarkStart w:id="56" w:name="the-order-matters"/>
       <w:r>
-        <w:t xml:space="preserve">🔑 The order matters</w:t>
+        <w:t xml:space="preserve">The order matters</w:t>
       </w:r>
       <w:bookmarkEnd w:id="56"/>
     </w:p>
@@ -8941,12 +8929,6 @@
       <w:pPr>
         <w:pStyle w:val="BlockText"/>
       </w:pPr>
-      <w:r>
-        <w:t xml:space="preserve">⚠️</w:t>
-      </w:r>
-      <w:r>
-        <w:t xml:space="preserve"> </w:t>
-      </w:r>
       <w:r>
         <w:rPr>
           <w:b/>
@@ -9606,7 +9588,7 @@
         <w:t xml:space="preserve"> </w:t>
       </w:r>
       <w:r>
-        <w:t xml:space="preserve">Not minimize — quit it. (Windows: the ✕ button. Mac:</w:t>
+        <w:t xml:space="preserve">Not minimize — quit it. (Windows: the X button in the corner. Mac:</w:t>
       </w:r>
       <w:r>
         <w:t xml:space="preserve"> </w:t>
@@ -11465,7 +11447,7 @@
         </w:numPr>
       </w:pPr>
       <w:r>
-        <w:t xml:space="preserve">Type your commands and click the lightning bolt (⚡)</w:t>
+        <w:t xml:space="preserve">Type your commands and click the lightning bolt icon</w:t>
       </w:r>
     </w:p>
     <w:p>

</xml_diff>